<commit_message>
Added Final Regiatration Paper
</commit_message>
<xml_diff>
--- a/Paper_Publication/Pages_8_Paper/Heterogeneous_Multi_Core_Soc_Architecture_For_Real_Time_Biomedical_Data_Analysis_8_Pages.docx
+++ b/Paper_Publication/Pages_8_Paper/Heterogeneous_Multi_Core_Soc_Architecture_For_Real_Time_Biomedical_Data_Analysis_8_Pages.docx
@@ -6040,7 +6040,7 @@
           <w:noProof/>
         </w:rPr>
         <w:drawing>
-          <wp:anchor distT="0" distB="0" distL="114300" distR="114300" simplePos="0" relativeHeight="251659264" behindDoc="0" locked="0" layoutInCell="1" allowOverlap="1" wp14:anchorId="0C930122" wp14:editId="576A1A5D">
+          <wp:anchor distT="0" distB="0" distL="114300" distR="114300" simplePos="0" relativeHeight="251659264" behindDoc="0" locked="0" layoutInCell="1" allowOverlap="1" wp14:anchorId="0C930122" wp14:editId="765CE418">
             <wp:simplePos x="0" y="0"/>
             <wp:positionH relativeFrom="column">
               <wp:posOffset>3636010</wp:posOffset>
@@ -6100,7 +6100,7 @@
           <w:noProof/>
         </w:rPr>
         <w:drawing>
-          <wp:anchor distT="0" distB="0" distL="114300" distR="114300" simplePos="0" relativeHeight="251658240" behindDoc="0" locked="0" layoutInCell="1" allowOverlap="1" wp14:anchorId="7A84C7B0" wp14:editId="44ADB79F">
+          <wp:anchor distT="0" distB="0" distL="114300" distR="114300" simplePos="0" relativeHeight="251658240" behindDoc="0" locked="0" layoutInCell="1" allowOverlap="1" wp14:anchorId="7A84C7B0" wp14:editId="6C5790DA">
             <wp:simplePos x="0" y="0"/>
             <wp:positionH relativeFrom="column">
               <wp:posOffset>1270</wp:posOffset>
@@ -13829,7 +13829,13 @@
         <w:t xml:space="preserve"> </w:t>
       </w:r>
       <w:r>
-        <w:t>real time biomedical signal analysis. Its architecture combines a common-purpose processor core with hardware processing units on FIR filtering, FFT processing, and CNN based [16] classification, enabling</w:t>
+        <w:t>real time biomedical signal analysis</w:t>
+      </w:r>
+      <w:r>
+        <w:t xml:space="preserve"> [3]</w:t>
+      </w:r>
+      <w:r>
+        <w:t>. Its architecture combines a common-purpose processor core with hardware processing units on FIR filtering, FFT processing, and CNN based [16] classification, enabling</w:t>
       </w:r>
       <w:r>
         <w:rPr>
@@ -13946,7 +13952,16 @@
         <w:t xml:space="preserve"> </w:t>
       </w:r>
       <w:r>
-        <w:t>data sent to a processing unit. The findings prove that the customization of an open processor platform on application specific hardware is an effective and efficient solution towards on-going biomedical monitoring and intelligent healthcare device solutions</w:t>
+        <w:t>data sent to a processing unit</w:t>
+      </w:r>
+      <w:r>
+        <w:t xml:space="preserve"> [2]</w:t>
+      </w:r>
+      <w:r>
+        <w:t>. The findings prove that the customization of an open processor platform on application specific hardware is an effective and efficient solution towards on-going biomedical monitoring and intelligent healthcare device solutions</w:t>
+      </w:r>
+      <w:r>
+        <w:t xml:space="preserve"> [1].</w:t>
       </w:r>
     </w:p>
     <w:p>

</xml_diff>